<commit_message>
Replace brand PPT with one-page design guide; add file index and image folders
Co-Authored-By: Claude Opus 5.5 <noreply@anthropic.com>
Claude-Session: https://claude.ai/code/session_01Q9jKbqwfC2QY6shEfWUhSP
</commit_message>
<xml_diff>
--- a/인스브룩크_전달자료/00_상세페이지_제작자료_12개항목.docx
+++ b/인스브룩크_전달자료/00_상세페이지_제작자료_12개항목.docx
@@ -20,6 +20,326 @@
         <w:t>(주)향기내는사람들(히즈빈스) → 인스브룩크  |  요청 자료 12개 항목 순서대로 정리</w:t>
       </w:r>
     </w:p>
+    <w:p>
+      <w:pPr>
+        <w:pStyle w:val="Heading1"/>
+      </w:pPr>
+      <w:r>
+        <w:t>첨부 파일 목록</w:t>
+      </w:r>
+    </w:p>
+    <w:tbl>
+      <w:tblPr>
+        <w:tblStyle w:val="TableGrid"/>
+        <w:tblW w:type="auto" w:w="0"/>
+        <w:tblLook w:firstColumn="1" w:firstRow="1" w:lastColumn="0" w:lastRow="0" w:noHBand="0" w:noVBand="1" w:val="04A0"/>
+      </w:tblPr>
+      <w:tblGrid>
+        <w:gridCol w:w="4320"/>
+        <w:gridCol w:w="4320"/>
+      </w:tblGrid>
+      <w:tr>
+        <w:tc>
+          <w:tcPr>
+            <w:tcW w:type="dxa" w:w="4320"/>
+          </w:tcPr>
+          <w:p>
+            <w:r>
+              <w:rPr>
+                <w:b/>
+              </w:rPr>
+              <w:t>1. 제품 상세 정보</w:t>
+            </w:r>
+          </w:p>
+        </w:tc>
+        <w:tc>
+          <w:tcPr>
+            <w:tcW w:type="dxa" w:w="4320"/>
+          </w:tcPr>
+          <w:p>
+            <w:r>
+              <w:t>01_제품정보 — 상품기본정보서.pdf, 패키지_표시사항.jpg, 패키지_주의사항.jpg</w:t>
+            </w:r>
+          </w:p>
+        </w:tc>
+      </w:tr>
+      <w:tr>
+        <w:tc>
+          <w:tcPr>
+            <w:tcW w:type="dxa" w:w="4320"/>
+          </w:tcPr>
+          <w:p>
+            <w:r>
+              <w:rPr>
+                <w:b/>
+              </w:rPr>
+              <w:t>2. 원두 정보</w:t>
+            </w:r>
+          </w:p>
+        </w:tc>
+        <w:tc>
+          <w:tcPr>
+            <w:tcW w:type="dxa" w:w="4320"/>
+          </w:tcPr>
+          <w:p>
+            <w:r>
+              <w:t>02_원두정보 — 테이스팅노트_산지_가공.png, 게이샤_스토리.png</w:t>
+            </w:r>
+          </w:p>
+        </w:tc>
+      </w:tr>
+      <w:tr>
+        <w:tc>
+          <w:tcPr>
+            <w:tcW w:type="dxa" w:w="4320"/>
+          </w:tcPr>
+          <w:p>
+            <w:r>
+              <w:rPr>
+                <w:b/>
+              </w:rPr>
+              <w:t>3. 테이스팅 노트</w:t>
+            </w:r>
+          </w:p>
+        </w:tc>
+        <w:tc>
+          <w:tcPr>
+            <w:tcW w:type="dxa" w:w="4320"/>
+          </w:tcPr>
+          <w:p>
+            <w:r>
+              <w:t>본 문서 2·3번 (별도 파일 없음)</w:t>
+            </w:r>
+          </w:p>
+        </w:tc>
+      </w:tr>
+      <w:tr>
+        <w:tc>
+          <w:tcPr>
+            <w:tcW w:type="dxa" w:w="4320"/>
+          </w:tcPr>
+          <w:p>
+            <w:r>
+              <w:rPr>
+                <w:b/>
+              </w:rPr>
+              <w:t>4. 장점·차별화</w:t>
+            </w:r>
+          </w:p>
+        </w:tc>
+        <w:tc>
+          <w:tcPr>
+            <w:tcW w:type="dxa" w:w="4320"/>
+          </w:tcPr>
+          <w:p>
+            <w:r>
+              <w:t>본 문서 4번 (별도 파일 없음)</w:t>
+            </w:r>
+          </w:p>
+        </w:tc>
+      </w:tr>
+      <w:tr>
+        <w:tc>
+          <w:tcPr>
+            <w:tcW w:type="dxa" w:w="4320"/>
+          </w:tcPr>
+          <w:p>
+            <w:r>
+              <w:rPr>
+                <w:b/>
+              </w:rPr>
+              <w:t>5. 홈카페 레시피</w:t>
+            </w:r>
+          </w:p>
+        </w:tc>
+        <w:tc>
+          <w:tcPr>
+            <w:tcW w:type="dxa" w:w="4320"/>
+          </w:tcPr>
+          <w:p>
+            <w:r>
+              <w:t>05_레시피 — 기존_레시피.png</w:t>
+            </w:r>
+          </w:p>
+        </w:tc>
+      </w:tr>
+      <w:tr>
+        <w:tc>
+          <w:tcPr>
+            <w:tcW w:type="dxa" w:w="4320"/>
+          </w:tcPr>
+          <w:p>
+            <w:r>
+              <w:rPr>
+                <w:b/>
+              </w:rPr>
+              <w:t>6. 인증·증빙</w:t>
+            </w:r>
+          </w:p>
+        </w:tc>
+        <w:tc>
+          <w:tcPr>
+            <w:tcW w:type="dxa" w:w="4320"/>
+          </w:tcPr>
+          <w:p>
+            <w:r>
+              <w:t>06_인증_증빙 — 특허증_제10-2144655호.jpg</w:t>
+            </w:r>
+          </w:p>
+        </w:tc>
+      </w:tr>
+      <w:tr>
+        <w:tc>
+          <w:tcPr>
+            <w:tcW w:type="dxa" w:w="4320"/>
+          </w:tcPr>
+          <w:p>
+            <w:r>
+              <w:rPr>
+                <w:b/>
+              </w:rPr>
+              <w:t>7. 브랜드·제품 스토리</w:t>
+            </w:r>
+          </w:p>
+        </w:tc>
+        <w:tc>
+          <w:tcPr>
+            <w:tcW w:type="dxa" w:w="4320"/>
+          </w:tcPr>
+          <w:p>
+            <w:r>
+              <w:t>본 문서 7번 (별도 파일 없음)</w:t>
+            </w:r>
+          </w:p>
+        </w:tc>
+      </w:tr>
+      <w:tr>
+        <w:tc>
+          <w:tcPr>
+            <w:tcW w:type="dxa" w:w="4320"/>
+          </w:tcPr>
+          <w:p>
+            <w:r>
+              <w:rPr>
+                <w:b/>
+              </w:rPr>
+              <w:t>8. 브랜드 디자인</w:t>
+            </w:r>
+          </w:p>
+        </w:tc>
+        <w:tc>
+          <w:tcPr>
+            <w:tcW w:type="dxa" w:w="4320"/>
+          </w:tcPr>
+          <w:p>
+            <w:r>
+              <w:t>08_브랜드디자인 — HISBEANS_로고.png, HISBEANS_브랜드디자인가이드.pdf</w:t>
+            </w:r>
+          </w:p>
+        </w:tc>
+      </w:tr>
+      <w:tr>
+        <w:tc>
+          <w:tcPr>
+            <w:tcW w:type="dxa" w:w="4320"/>
+          </w:tcPr>
+          <w:p>
+            <w:r>
+              <w:rPr>
+                <w:b/>
+              </w:rPr>
+              <w:t>9. 사용 방법·추천 대상</w:t>
+            </w:r>
+          </w:p>
+        </w:tc>
+        <w:tc>
+          <w:tcPr>
+            <w:tcW w:type="dxa" w:w="4320"/>
+          </w:tcPr>
+          <w:p>
+            <w:r>
+              <w:t>본 문서 9번 (별도 파일 없음)</w:t>
+            </w:r>
+          </w:p>
+        </w:tc>
+      </w:tr>
+      <w:tr>
+        <w:tc>
+          <w:tcPr>
+            <w:tcW w:type="dxa" w:w="4320"/>
+          </w:tcPr>
+          <w:p>
+            <w:r>
+              <w:rPr>
+                <w:b/>
+              </w:rPr>
+              <w:t>10. 보관·배송</w:t>
+            </w:r>
+          </w:p>
+        </w:tc>
+        <w:tc>
+          <w:tcPr>
+            <w:tcW w:type="dxa" w:w="4320"/>
+          </w:tcPr>
+          <w:p>
+            <w:r>
+              <w:t>본 문서 10번 (별도 파일 없음)</w:t>
+            </w:r>
+          </w:p>
+        </w:tc>
+      </w:tr>
+      <w:tr>
+        <w:tc>
+          <w:tcPr>
+            <w:tcW w:type="dxa" w:w="4320"/>
+          </w:tcPr>
+          <w:p>
+            <w:r>
+              <w:rPr>
+                <w:b/>
+              </w:rPr>
+              <w:t>11. 고객 리뷰</w:t>
+            </w:r>
+          </w:p>
+        </w:tc>
+        <w:tc>
+          <w:tcPr>
+            <w:tcW w:type="dxa" w:w="4320"/>
+          </w:tcPr>
+          <w:p>
+            <w:r>
+              <w:t>11_리뷰 — 리뷰 요약 캡처 1장 + 리뷰 원문 캡처 10장</w:t>
+            </w:r>
+          </w:p>
+        </w:tc>
+      </w:tr>
+      <w:tr>
+        <w:tc>
+          <w:tcPr>
+            <w:tcW w:type="dxa" w:w="4320"/>
+          </w:tcPr>
+          <w:p>
+            <w:r>
+              <w:rPr>
+                <w:b/>
+              </w:rPr>
+              <w:t>12. 제품 이미지</w:t>
+            </w:r>
+          </w:p>
+        </w:tc>
+        <w:tc>
+          <w:tcPr>
+            <w:tcW w:type="dxa" w:w="4320"/>
+          </w:tcPr>
+          <w:p>
+            <w:r>
+              <w:t>12_제품이미지 — 누끼(배경 제거) PNG, 연출컷 4K, 연출컷 원본, 패키지 이미지</w:t>
+            </w:r>
+          </w:p>
+        </w:tc>
+      </w:tr>
+    </w:tbl>
+    <w:p/>
     <w:p>
       <w:pPr>
         <w:pStyle w:val="Heading1"/>
@@ -1525,7 +1845,7 @@
           <w:color w:val="808080"/>
           <w:sz w:val="18"/>
         </w:rPr>
-        <w:t>▶ 첨부 파일: 08_브랜드디자인/HISBEANS_로고.png, 히즈빈스_브랜드가이드라인_Ver2024.pptx</w:t>
+        <w:t>▶ 첨부 파일: 08_브랜드디자인/HISBEANS_로고.png, HISBEANS_브랜드디자인가이드.pdf (가이드라인 Ver.2024 요약)</w:t>
       </w:r>
     </w:p>
     <w:p>
@@ -1895,7 +2215,7 @@
           <w:color w:val="808080"/>
           <w:sz w:val="18"/>
         </w:rPr>
-        <w:t>▶ 첨부 파일: 11_리뷰/ 리뷰 요약 캡처 + 리뷰 원문 캡처 11건</w:t>
+        <w:t>▶ 첨부 파일: 11_리뷰/ 리뷰 요약 캡처 1장 + 리뷰 원문 캡처 10장</w:t>
       </w:r>
     </w:p>
     <w:p>
@@ -1911,7 +2231,7 @@
         <w:pStyle w:val="ListBullet"/>
       </w:pPr>
       <w:r>
-        <w:t>연출컷 3종: 원본 + Higgsfield 4K 업스케일본</w:t>
+        <w:t>누끼(배경 제거) 이미지 3종 — 투명 배경 PNG</w:t>
       </w:r>
     </w:p>
     <w:p>
@@ -1919,7 +2239,7 @@
         <w:pStyle w:val="ListBullet"/>
       </w:pPr>
       <w:r>
-        <w:t>누끼(배경 제거) 이미지: Higgsfield 배경 제거본 (PNG)</w:t>
+        <w:t>연출컷 3종 — 4K 고해상도본 + 원본</w:t>
       </w:r>
     </w:p>
     <w:p>
@@ -1947,7 +2267,7 @@
           <w:color w:val="808080"/>
           <w:sz w:val="18"/>
         </w:rPr>
-        <w:t>▶ 첨부 파일: 12_제품이미지/</w:t>
+        <w:t>▶ 첨부 파일: 12_제품이미지/누끼, 12_제품이미지/연출컷_4K, 12_제품이미지/연출컷_원본, 12_제품이미지/패키지</w:t>
       </w:r>
     </w:p>
     <w:sectPr>

</xml_diff>